<commit_message>
Asymmetric blue-only delay results (e5_asym): STUDY.md 4.8, abstract/discussion/conclusion; docx regenerated
Co-Authored-By: Claude Opus 5.5 <noreply@anthropic.com>
</commit_message>
<xml_diff>
--- a/ai-combat-core2-main/STUDY.docx
+++ b/ai-combat-core2-main/STUDY.docx
@@ -145,7 +145,7 @@
         <w:jc w:val="both"/>
       </w:pPr>
       <w:r>
-        <w:t xml:space="preserve">근접 공중전을 수행하는 AI 조종사 연구는 전술 판단에 집중되어 왔고, 저수준 비행제어기의 설계가 교전에 미치는 영향은 정량적으로 다뤄지지 않았다. 본 연구는 JSBSim F-16 기반 5계층 교전 환경에서 증분 비선형 동적 역변환(INDI) 각속도 제어기의 파라미터 6개(롤·피치 각속도 게인, 동기화 필터 차단주파수, 자세 게인, 명령 피드포워드, 조종 증분 정칙화)를 튜닝하고, 그 영향을 명령 추종, 기동 결과, 교전 결과의 세 층위에서 약 12,000회의 대응 비교 교전으로 측정하였다. F-16 교범의 가용 G 한계를 속도의 함수로 정식화해 모든 교전에서 달성 하중을 감시하였고, 공개 JSBSim F-16 모델에서 롤 명령이 대칭 양력을 만드는 flaperon 혼합 결함을 찾아 수정하였다. 입자군집최적화로 얻은 튜닝 설정은 기준 설정 대비 추종 오차를 8–12 %, 조종면 활동량을 66–84 % 줄였다. 측정 지연이 없는 조건에서 튜닝은 명령 추종 층위를 유의하게 개선하였으나 기동과 교전 결과로는 전이되지 않았다. 반면 기준 제어기는 8–17 ms의 각속도 측정 지연에서 요구 G의 절반만 실현하며 붕괴하였고, 튜닝 제어기는 G 실현률을 유지해 공세 위치와 에너지 우위를 확보하였다(33 ms 지연에서 승률 0.45 → 0.89–0.91, p &lt; 0.001). 필터 분리 실험과 안정 경계 지도로부터 지연 강건성은 동기화 필터 대역이 결정하며 허용 지연이 차단주파수에 반비례함(τ_max ≈ (0.15–0.3)/f_c)을 확인하였다. 이 결과는 전술 트리 3종에서 재현되었다.</w:t>
+        <w:t xml:space="preserve">근접 공중전을 수행하는 AI 조종사 연구는 전술 판단에 집중되어 왔고, 저수준 비행제어기의 설계가 교전에 미치는 영향은 정량적으로 다뤄지지 않았다. 본 연구는 JSBSim F-16 기반 5계층 교전 환경에서 증분 비선형 동적 역변환(INDI) 각속도 제어기의 파라미터 6개(롤·피치 각속도 게인, 동기화 필터 차단주파수, 자세 게인, 명령 피드포워드, 조종 증분 정칙화)를 튜닝하고, 그 영향을 명령 추종, 기동 결과, 교전 결과의 세 층위에서 약 12,000회의 대응 비교 교전으로 측정하였다. F-16 교범의 가용 G 한계를 속도의 함수로 정식화해 모든 교전에서 달성 하중을 감시하였고, 공개 JSBSim F-16 모델에서 롤 명령이 대칭 양력을 만드는 flaperon 혼합 결함을 찾아 수정하였다. 입자군집최적화로 얻은 튜닝 설정은 기준 설정 대비 추종 오차를 8–12 %, 조종면 활동량을 66–84 % 줄였다. 측정 지연이 없는 조건에서 튜닝은 명령 추종 층위를 유의하게 개선하였으나 기동과 교전 결과로는 전이되지 않았다. 반면 기준 제어기는 8–17 ms의 각속도 측정 지연에서 요구 G의 절반만 실현하며 붕괴하였고, 튜닝 제어기는 G 실현률을 유지해 공세 위치와 에너지 우위를 확보하였다(33 ms 지연에서 승률 0.45 → 0.89–0.91, p &lt; 0.001). 자기 측만 17 ms 지연된 비대칭 조건에서도 기준 제어기의 승률은 0.21로 떨어진 반면 튜닝 제어기는 0.52–0.55를 유지하였다(p &lt; 0.001). 필터 분리 실험과 안정 경계 지도로부터 지연 강건성은 동기화 필터 대역이 결정하며 허용 지연이 차단주파수에 반비례함(τ_max ≈ (0.15–0.3)/f_c)을 확인하였다. 이 결과는 전술 트리 3종에서 재현되었다.</w:t>
       </w:r>
     </w:p>
     <w:p>
@@ -178,7 +178,7 @@
         <w:jc w:val="both"/>
       </w:pPr>
       <w:r>
-        <w:t xml:space="preserve">Research on AI pilots for within-visual-range air combat has focused on tactical decision making, while the effect of low-level flight-control design on engagement outcomes has not been quantified. We tuned six parameters of an incremental nonlinear dynamic inversion (INDI) body-rate controller — roll and pitch rate gains, synchronization-filter cutoff, attitude gain, rate-command feedforward and increment regularization — in a five-layer engagement stack built on the JSBSim F-16, and measured their effect at three levels (command tracking, maneuvering outcome, engagement outcome) in about 12,000 paired engagements. The F-16 manual's usable load-factor envelope was formulated as a function of airspeed and the achieved load factor was monitored in every engagement; a flaperon-mixing sign defect in the public JSBSim F-16 model, which made roll commands generate symmetric lift, was identified and corrected. Particle-swarm-optimized settings reduced tracking error by 8–12 % and control activity by 66–84 %. Without measurement delay, tuning significantly improved command tracking but did not propagate to maneuvering or engagement outcomes. The baseline controller, however, collapsed at 8–17 ms of rate-measurement delay, realizing only half of the commanded load factor, whereas the tuned controllers maintained it and gained offensive position and energy advantage (win rate 0.45 → 0.89–0.91 at 33 ms, p &lt; 0.001). Filter ablation and a stability map showed that delay robustness is governed by the synchronization-filter bandwidth, with the tolerable delay inversely proportional to the cutoff frequency (τ_max ≈ (0.15–0.3)/f_c). The findings were reproduced across three tactical trees.</w:t>
+        <w:t xml:space="preserve">Research on AI pilots for within-visual-range air combat has focused on tactical decision making, while the effect of low-level flight-control design on engagement outcomes has not been quantified. We tuned six parameters of an incremental nonlinear dynamic inversion (INDI) body-rate controller — roll and pitch rate gains, synchronization-filter cutoff, attitude gain, rate-command feedforward and increment regularization — in a five-layer engagement stack built on the JSBSim F-16, and measured their effect at three levels (command tracking, maneuvering outcome, engagement outcome) in about 12,000 paired engagements. The F-16 manual's usable load-factor envelope was formulated as a function of airspeed and the achieved load factor was monitored in every engagement; a flaperon-mixing sign defect in the public JSBSim F-16 model, which made roll commands generate symmetric lift, was identified and corrected. Particle-swarm-optimized settings reduced tracking error by 8–12 % and control activity by 66–84 %. Without measurement delay, tuning significantly improved command tracking but did not propagate to maneuvering or engagement outcomes. The baseline controller, however, collapsed at 8–17 ms of rate-measurement delay, realizing only half of the commanded load factor, whereas the tuned controllers maintained it and gained offensive position and energy advantage (win rate 0.45 → 0.89–0.91 at 33 ms, p &lt; 0.001). With a 17 ms delay on the own aircraft only, the baseline's win rate fell to 0.21 while the tuned controllers held 0.52–0.55 (p &lt; 0.001). Filter ablation and a stability map showed that delay robustness is governed by the synchronization-filter bandwidth, with the tolerable delay inversely proportional to the cutoff frequency (τ_max ≈ (0.15–0.3)/f_c). The findings were reproduced across three tactical trees.</w:t>
       </w:r>
     </w:p>
     <w:p>
@@ -16584,7 +16584,7 @@
         <w:jc w:val="both"/>
       </w:pPr>
       <w:r>
-        <w:t xml:space="preserve">기준 INDI는 8 ms에서 G 실현률이 0.88로 저하되기 시작하였고 17 ms에서 0.52로 붕괴하였다. 붕괴 임계는 8–17 ms 사이이며, 이는 비행시험에서 보고된 측정 지연(30–90 ms)[G][S]보다 훨씬 짧다. 튜닝 설정의 승률이 지연과 함께 높아지는 것은 같은 지연을 받는 red(기준 INDI)가 무너지기 때문이다.</w:t>
+        <w:t xml:space="preserve">기준 INDI는 8 ms에서 G 실현률이 0.88로 저하되기 시작하였고 17 ms에서 0.52로 붕괴하였다. 붕괴 임계는 8–17 ms 사이이며, 이는 비행시험에서 보고된 측정 지연(30–90 ms)[G][S]보다 훨씬 짧다. 튜닝 설정의 승률이 지연과 함께 높아지는 것에는 같은 지연을 받는 red(기준 INDI)의 붕괴가 섞여 있으며, 자기 측 지연만의 효과는 4.8절에서 분리하였다.</w:t>
       </w:r>
     </w:p>
     <w:p>
@@ -18565,6 +18565,2019 @@
     </w:p>
     <w:p>
       <w:pPr>
+        <w:pStyle w:val="Heading2"/>
+      </w:pPr>
+      <w:r>
+        <w:t xml:space="preserve">4.8 비대칭 지연: 자기 측 지연에 대한 강건성</w:t>
+      </w:r>
+    </w:p>
+    <w:p>
+      <w:pPr>
+        <w:spacing w:after="120"/>
+        <w:jc w:val="both"/>
+      </w:pPr>
+      <w:r>
+        <w:t xml:space="preserve">4.2절과 4.6절의 지연 조건은 양측이 같은 지연을 받으므로, 튜닝 설정의 승률 상승에는 상대(기준 INDI)의 붕괴가 섞여 있다. 튜닝이 자기 기체를 지연으로부터 보호하는지 분리하기 위해, blue에만 17, 33, 92 ms의 측정 지연을 주고 red(기준 INDI)는 지연 없이 두었다(표 15, 조건·설정별 100 대응 쌍). 지연이 없을 때 blue 승률은 0.53이다.</w:t>
+      </w:r>
+    </w:p>
+    <w:p>
+      <w:pPr>
+        <w:spacing w:after="120"/>
+        <w:jc w:val="both"/>
+      </w:pPr>
+      <w:r>
+        <w:rPr>
+          <w:b/>
+          <w:bCs/>
+        </w:rPr>
+        <w:t xml:space="preserve">표 15.</w:t>
+      </w:r>
+      <w:r>
+        <w:t xml:space="preserve"> blue 단독 지연 조건 (red = 기준 INDI, 지연 없음). Holm 보정은 9개 비교를 한 가족으로 하였다.</w:t>
+      </w:r>
+    </w:p>
+    <w:tbl>
+      <w:tblPr>
+        <w:tblW w:type="dxa" w:w="9024"/>
+        <w:tblBorders>
+          <w:top w:val="single" w:color="auto" w:sz="4"/>
+          <w:left w:val="single" w:color="auto" w:sz="4"/>
+          <w:bottom w:val="single" w:color="auto" w:sz="4"/>
+          <w:right w:val="single" w:color="auto" w:sz="4"/>
+          <w:insideH w:val="single" w:color="auto" w:sz="4"/>
+          <w:insideV w:val="single" w:color="auto" w:sz="4"/>
+        </w:tblBorders>
+      </w:tblPr>
+      <w:tblGrid>
+        <w:gridCol w:w="1504"/>
+        <w:gridCol w:w="1504"/>
+        <w:gridCol w:w="1504"/>
+        <w:gridCol w:w="1504"/>
+        <w:gridCol w:w="1504"/>
+        <w:gridCol w:w="1504"/>
+      </w:tblGrid>
+      <w:tr>
+        <w:trPr>
+          <w:tblHeader/>
+        </w:trPr>
+        <w:tc>
+          <w:tcPr>
+            <w:tcW w:type="dxa" w:w="1504"/>
+            <w:tcBorders>
+              <w:top w:val="single" w:color="999999" w:sz="4"/>
+              <w:left w:val="single" w:color="999999" w:sz="4"/>
+              <w:bottom w:val="single" w:color="999999" w:sz="4"/>
+              <w:right w:val="single" w:color="999999" w:sz="4"/>
+            </w:tcBorders>
+            <w:shd w:fill="E8E8E8" w:color="auto" w:val="clear"/>
+          </w:tcPr>
+          <w:p>
+            <w:pPr>
+              <w:jc w:val="center"/>
+            </w:pPr>
+            <w:r>
+              <w:rPr>
+                <w:b/>
+                <w:bCs/>
+                <w:sz w:val="17"/>
+                <w:szCs w:val="17"/>
+              </w:rPr>
+              <w:t xml:space="preserve">지연</w:t>
+            </w:r>
+          </w:p>
+        </w:tc>
+        <w:tc>
+          <w:tcPr>
+            <w:tcW w:type="dxa" w:w="1504"/>
+            <w:tcBorders>
+              <w:top w:val="single" w:color="999999" w:sz="4"/>
+              <w:left w:val="single" w:color="999999" w:sz="4"/>
+              <w:bottom w:val="single" w:color="999999" w:sz="4"/>
+              <w:right w:val="single" w:color="999999" w:sz="4"/>
+            </w:tcBorders>
+            <w:shd w:fill="E8E8E8" w:color="auto" w:val="clear"/>
+          </w:tcPr>
+          <w:p>
+            <w:pPr>
+              <w:jc w:val="center"/>
+            </w:pPr>
+            <w:r>
+              <w:rPr>
+                <w:b/>
+                <w:bCs/>
+                <w:sz w:val="17"/>
+                <w:szCs w:val="17"/>
+              </w:rPr>
+              <w:t xml:space="preserve">blue 설정</w:t>
+            </w:r>
+          </w:p>
+        </w:tc>
+        <w:tc>
+          <w:tcPr>
+            <w:tcW w:type="dxa" w:w="1504"/>
+            <w:tcBorders>
+              <w:top w:val="single" w:color="999999" w:sz="4"/>
+              <w:left w:val="single" w:color="999999" w:sz="4"/>
+              <w:bottom w:val="single" w:color="999999" w:sz="4"/>
+              <w:right w:val="single" w:color="999999" w:sz="4"/>
+            </w:tcBorders>
+            <w:shd w:fill="E8E8E8" w:color="auto" w:val="clear"/>
+          </w:tcPr>
+          <w:p>
+            <w:pPr>
+              <w:jc w:val="center"/>
+            </w:pPr>
+            <w:r>
+              <w:rPr>
+                <w:b/>
+                <w:bCs/>
+                <w:sz w:val="17"/>
+                <w:szCs w:val="17"/>
+              </w:rPr>
+              <w:t xml:space="preserve">승률</w:t>
+            </w:r>
+          </w:p>
+        </w:tc>
+        <w:tc>
+          <w:tcPr>
+            <w:tcW w:type="dxa" w:w="1504"/>
+            <w:tcBorders>
+              <w:top w:val="single" w:color="999999" w:sz="4"/>
+              <w:left w:val="single" w:color="999999" w:sz="4"/>
+              <w:bottom w:val="single" w:color="999999" w:sz="4"/>
+              <w:right w:val="single" w:color="999999" w:sz="4"/>
+            </w:tcBorders>
+            <w:shd w:fill="E8E8E8" w:color="auto" w:val="clear"/>
+          </w:tcPr>
+          <w:p>
+            <w:pPr>
+              <w:jc w:val="center"/>
+            </w:pPr>
+            <w:r>
+              <w:rPr>
+                <w:b/>
+                <w:bCs/>
+                <w:sz w:val="17"/>
+                <w:szCs w:val="17"/>
+              </w:rPr>
+              <w:t xml:space="preserve">G 실현률</w:t>
+            </w:r>
+          </w:p>
+        </w:tc>
+        <w:tc>
+          <w:tcPr>
+            <w:tcW w:type="dxa" w:w="1504"/>
+            <w:tcBorders>
+              <w:top w:val="single" w:color="999999" w:sz="4"/>
+              <w:left w:val="single" w:color="999999" w:sz="4"/>
+              <w:bottom w:val="single" w:color="999999" w:sz="4"/>
+              <w:right w:val="single" w:color="999999" w:sz="4"/>
+            </w:tcBorders>
+            <w:shd w:fill="E8E8E8" w:color="auto" w:val="clear"/>
+          </w:tcPr>
+          <w:p>
+            <w:pPr>
+              <w:jc w:val="center"/>
+            </w:pPr>
+            <w:r>
+              <w:rPr>
+                <w:b/>
+                <w:bCs/>
+                <w:sz w:val="17"/>
+                <w:szCs w:val="17"/>
+              </w:rPr>
+              <w:t xml:space="preserve">Δ승점 [95 % CI]</w:t>
+            </w:r>
+          </w:p>
+        </w:tc>
+        <w:tc>
+          <w:tcPr>
+            <w:tcW w:type="dxa" w:w="1504"/>
+            <w:tcBorders>
+              <w:top w:val="single" w:color="999999" w:sz="4"/>
+              <w:left w:val="single" w:color="999999" w:sz="4"/>
+              <w:bottom w:val="single" w:color="999999" w:sz="4"/>
+              <w:right w:val="single" w:color="999999" w:sz="4"/>
+            </w:tcBorders>
+            <w:shd w:fill="E8E8E8" w:color="auto" w:val="clear"/>
+          </w:tcPr>
+          <w:p>
+            <w:pPr>
+              <w:jc w:val="center"/>
+            </w:pPr>
+            <w:r>
+              <w:rPr>
+                <w:b/>
+                <w:bCs/>
+                <w:sz w:val="17"/>
+                <w:szCs w:val="17"/>
+              </w:rPr>
+              <w:t xml:space="preserve">p(부호, Holm)</w:t>
+            </w:r>
+          </w:p>
+        </w:tc>
+      </w:tr>
+      <w:tr>
+        <w:trPr>
+          <w:tblHeader w:val="off"/>
+        </w:trPr>
+        <w:tc>
+          <w:tcPr>
+            <w:tcW w:type="dxa" w:w="1504"/>
+            <w:tcBorders>
+              <w:top w:val="single" w:color="999999" w:sz="4"/>
+              <w:left w:val="single" w:color="999999" w:sz="4"/>
+              <w:bottom w:val="single" w:color="999999" w:sz="4"/>
+              <w:right w:val="single" w:color="999999" w:sz="4"/>
+            </w:tcBorders>
+          </w:tcPr>
+          <w:p>
+            <w:pPr>
+              <w:jc w:val="center"/>
+            </w:pPr>
+            <w:r>
+              <w:rPr>
+                <w:b w:val="false"/>
+                <w:bCs w:val="false"/>
+                <w:sz w:val="17"/>
+                <w:szCs w:val="17"/>
+              </w:rPr>
+              <w:t xml:space="preserve">17 ms</w:t>
+            </w:r>
+          </w:p>
+        </w:tc>
+        <w:tc>
+          <w:tcPr>
+            <w:tcW w:type="dxa" w:w="1504"/>
+            <w:tcBorders>
+              <w:top w:val="single" w:color="999999" w:sz="4"/>
+              <w:left w:val="single" w:color="999999" w:sz="4"/>
+              <w:bottom w:val="single" w:color="999999" w:sz="4"/>
+              <w:right w:val="single" w:color="999999" w:sz="4"/>
+            </w:tcBorders>
+          </w:tcPr>
+          <w:p>
+            <w:pPr>
+              <w:jc w:val="center"/>
+            </w:pPr>
+            <w:r>
+              <w:rPr>
+                <w:b w:val="false"/>
+                <w:bCs w:val="false"/>
+                <w:sz w:val="17"/>
+                <w:szCs w:val="17"/>
+              </w:rPr>
+              <w:t xml:space="preserve">기준</w:t>
+            </w:r>
+          </w:p>
+        </w:tc>
+        <w:tc>
+          <w:tcPr>
+            <w:tcW w:type="dxa" w:w="1504"/>
+            <w:tcBorders>
+              <w:top w:val="single" w:color="999999" w:sz="4"/>
+              <w:left w:val="single" w:color="999999" w:sz="4"/>
+              <w:bottom w:val="single" w:color="999999" w:sz="4"/>
+              <w:right w:val="single" w:color="999999" w:sz="4"/>
+            </w:tcBorders>
+          </w:tcPr>
+          <w:p>
+            <w:pPr>
+              <w:jc w:val="center"/>
+            </w:pPr>
+            <w:r>
+              <w:rPr>
+                <w:b w:val="false"/>
+                <w:bCs w:val="false"/>
+                <w:sz w:val="17"/>
+                <w:szCs w:val="17"/>
+              </w:rPr>
+              <w:t xml:space="preserve">0.210</w:t>
+            </w:r>
+          </w:p>
+        </w:tc>
+        <w:tc>
+          <w:tcPr>
+            <w:tcW w:type="dxa" w:w="1504"/>
+            <w:tcBorders>
+              <w:top w:val="single" w:color="999999" w:sz="4"/>
+              <w:left w:val="single" w:color="999999" w:sz="4"/>
+              <w:bottom w:val="single" w:color="999999" w:sz="4"/>
+              <w:right w:val="single" w:color="999999" w:sz="4"/>
+            </w:tcBorders>
+          </w:tcPr>
+          <w:p>
+            <w:pPr>
+              <w:jc w:val="center"/>
+            </w:pPr>
+            <w:r>
+              <w:rPr>
+                <w:b w:val="false"/>
+                <w:bCs w:val="false"/>
+                <w:sz w:val="17"/>
+                <w:szCs w:val="17"/>
+              </w:rPr>
+              <w:t xml:space="preserve">0.54</w:t>
+            </w:r>
+          </w:p>
+        </w:tc>
+        <w:tc>
+          <w:tcPr>
+            <w:tcW w:type="dxa" w:w="1504"/>
+            <w:tcBorders>
+              <w:top w:val="single" w:color="999999" w:sz="4"/>
+              <w:left w:val="single" w:color="999999" w:sz="4"/>
+              <w:bottom w:val="single" w:color="999999" w:sz="4"/>
+              <w:right w:val="single" w:color="999999" w:sz="4"/>
+            </w:tcBorders>
+          </w:tcPr>
+          <w:p>
+            <w:pPr>
+              <w:jc w:val="center"/>
+            </w:pPr>
+            <w:r>
+              <w:rPr>
+                <w:b w:val="false"/>
+                <w:bCs w:val="false"/>
+                <w:sz w:val="17"/>
+                <w:szCs w:val="17"/>
+              </w:rPr>
+              <w:t xml:space="preserve">—</w:t>
+            </w:r>
+          </w:p>
+        </w:tc>
+        <w:tc>
+          <w:tcPr>
+            <w:tcW w:type="dxa" w:w="1504"/>
+            <w:tcBorders>
+              <w:top w:val="single" w:color="999999" w:sz="4"/>
+              <w:left w:val="single" w:color="999999" w:sz="4"/>
+              <w:bottom w:val="single" w:color="999999" w:sz="4"/>
+              <w:right w:val="single" w:color="999999" w:sz="4"/>
+            </w:tcBorders>
+          </w:tcPr>
+          <w:p>
+            <w:pPr>
+              <w:jc w:val="center"/>
+            </w:pPr>
+            <w:r>
+              <w:rPr>
+                <w:b w:val="false"/>
+                <w:bCs w:val="false"/>
+                <w:sz w:val="17"/>
+                <w:szCs w:val="17"/>
+              </w:rPr>
+              <w:t xml:space="preserve">—</w:t>
+            </w:r>
+          </w:p>
+        </w:tc>
+      </w:tr>
+      <w:tr>
+        <w:trPr>
+          <w:tblHeader w:val="off"/>
+        </w:trPr>
+        <w:tc>
+          <w:tcPr>
+            <w:tcW w:type="dxa" w:w="1504"/>
+            <w:tcBorders>
+              <w:top w:val="single" w:color="999999" w:sz="4"/>
+              <w:left w:val="single" w:color="999999" w:sz="4"/>
+              <w:bottom w:val="single" w:color="999999" w:sz="4"/>
+              <w:right w:val="single" w:color="999999" w:sz="4"/>
+            </w:tcBorders>
+          </w:tcPr>
+          <w:p>
+            <w:pPr>
+              <w:jc w:val="center"/>
+            </w:pPr>
+          </w:p>
+        </w:tc>
+        <w:tc>
+          <w:tcPr>
+            <w:tcW w:type="dxa" w:w="1504"/>
+            <w:tcBorders>
+              <w:top w:val="single" w:color="999999" w:sz="4"/>
+              <w:left w:val="single" w:color="999999" w:sz="4"/>
+              <w:bottom w:val="single" w:color="999999" w:sz="4"/>
+              <w:right w:val="single" w:color="999999" w:sz="4"/>
+            </w:tcBorders>
+          </w:tcPr>
+          <w:p>
+            <w:pPr>
+              <w:jc w:val="center"/>
+            </w:pPr>
+            <w:r>
+              <w:rPr>
+                <w:b w:val="false"/>
+                <w:bCs w:val="false"/>
+                <w:sz w:val="17"/>
+                <w:szCs w:val="17"/>
+              </w:rPr>
+              <w:t xml:space="preserve">성능형</w:t>
+            </w:r>
+          </w:p>
+        </w:tc>
+        <w:tc>
+          <w:tcPr>
+            <w:tcW w:type="dxa" w:w="1504"/>
+            <w:tcBorders>
+              <w:top w:val="single" w:color="999999" w:sz="4"/>
+              <w:left w:val="single" w:color="999999" w:sz="4"/>
+              <w:bottom w:val="single" w:color="999999" w:sz="4"/>
+              <w:right w:val="single" w:color="999999" w:sz="4"/>
+            </w:tcBorders>
+          </w:tcPr>
+          <w:p>
+            <w:pPr>
+              <w:jc w:val="center"/>
+            </w:pPr>
+            <w:r>
+              <w:rPr>
+                <w:b w:val="false"/>
+                <w:bCs w:val="false"/>
+                <w:sz w:val="17"/>
+                <w:szCs w:val="17"/>
+              </w:rPr>
+              <w:t xml:space="preserve">0.515</w:t>
+            </w:r>
+          </w:p>
+        </w:tc>
+        <w:tc>
+          <w:tcPr>
+            <w:tcW w:type="dxa" w:w="1504"/>
+            <w:tcBorders>
+              <w:top w:val="single" w:color="999999" w:sz="4"/>
+              <w:left w:val="single" w:color="999999" w:sz="4"/>
+              <w:bottom w:val="single" w:color="999999" w:sz="4"/>
+              <w:right w:val="single" w:color="999999" w:sz="4"/>
+            </w:tcBorders>
+          </w:tcPr>
+          <w:p>
+            <w:pPr>
+              <w:jc w:val="center"/>
+            </w:pPr>
+            <w:r>
+              <w:rPr>
+                <w:b w:val="false"/>
+                <w:bCs w:val="false"/>
+                <w:sz w:val="17"/>
+                <w:szCs w:val="17"/>
+              </w:rPr>
+              <w:t xml:space="preserve">0.93</w:t>
+            </w:r>
+          </w:p>
+        </w:tc>
+        <w:tc>
+          <w:tcPr>
+            <w:tcW w:type="dxa" w:w="1504"/>
+            <w:tcBorders>
+              <w:top w:val="single" w:color="999999" w:sz="4"/>
+              <w:left w:val="single" w:color="999999" w:sz="4"/>
+              <w:bottom w:val="single" w:color="999999" w:sz="4"/>
+              <w:right w:val="single" w:color="999999" w:sz="4"/>
+            </w:tcBorders>
+          </w:tcPr>
+          <w:p>
+            <w:pPr>
+              <w:jc w:val="center"/>
+            </w:pPr>
+            <w:r>
+              <w:rPr>
+                <w:b w:val="false"/>
+                <w:bCs w:val="false"/>
+                <w:sz w:val="17"/>
+                <w:szCs w:val="17"/>
+              </w:rPr>
+              <w:t xml:space="preserve">+0.305 [+0.200, +0.405]</w:t>
+            </w:r>
+          </w:p>
+        </w:tc>
+        <w:tc>
+          <w:tcPr>
+            <w:tcW w:type="dxa" w:w="1504"/>
+            <w:tcBorders>
+              <w:top w:val="single" w:color="999999" w:sz="4"/>
+              <w:left w:val="single" w:color="999999" w:sz="4"/>
+              <w:bottom w:val="single" w:color="999999" w:sz="4"/>
+              <w:right w:val="single" w:color="999999" w:sz="4"/>
+            </w:tcBorders>
+          </w:tcPr>
+          <w:p>
+            <w:pPr>
+              <w:jc w:val="center"/>
+            </w:pPr>
+            <w:r>
+              <w:rPr>
+                <w:b w:val="false"/>
+                <w:bCs w:val="false"/>
+                <w:sz w:val="17"/>
+                <w:szCs w:val="17"/>
+              </w:rPr>
+              <w:t xml:space="preserve">&lt; 0.001</w:t>
+            </w:r>
+          </w:p>
+        </w:tc>
+      </w:tr>
+      <w:tr>
+        <w:trPr>
+          <w:tblHeader w:val="off"/>
+        </w:trPr>
+        <w:tc>
+          <w:tcPr>
+            <w:tcW w:type="dxa" w:w="1504"/>
+            <w:tcBorders>
+              <w:top w:val="single" w:color="999999" w:sz="4"/>
+              <w:left w:val="single" w:color="999999" w:sz="4"/>
+              <w:bottom w:val="single" w:color="999999" w:sz="4"/>
+              <w:right w:val="single" w:color="999999" w:sz="4"/>
+            </w:tcBorders>
+          </w:tcPr>
+          <w:p>
+            <w:pPr>
+              <w:jc w:val="center"/>
+            </w:pPr>
+          </w:p>
+        </w:tc>
+        <w:tc>
+          <w:tcPr>
+            <w:tcW w:type="dxa" w:w="1504"/>
+            <w:tcBorders>
+              <w:top w:val="single" w:color="999999" w:sz="4"/>
+              <w:left w:val="single" w:color="999999" w:sz="4"/>
+              <w:bottom w:val="single" w:color="999999" w:sz="4"/>
+              <w:right w:val="single" w:color="999999" w:sz="4"/>
+            </w:tcBorders>
+          </w:tcPr>
+          <w:p>
+            <w:pPr>
+              <w:jc w:val="center"/>
+            </w:pPr>
+            <w:r>
+              <w:rPr>
+                <w:b w:val="false"/>
+                <w:bCs w:val="false"/>
+                <w:sz w:val="17"/>
+                <w:szCs w:val="17"/>
+              </w:rPr>
+              <w:t xml:space="preserve">절충형</w:t>
+            </w:r>
+          </w:p>
+        </w:tc>
+        <w:tc>
+          <w:tcPr>
+            <w:tcW w:type="dxa" w:w="1504"/>
+            <w:tcBorders>
+              <w:top w:val="single" w:color="999999" w:sz="4"/>
+              <w:left w:val="single" w:color="999999" w:sz="4"/>
+              <w:bottom w:val="single" w:color="999999" w:sz="4"/>
+              <w:right w:val="single" w:color="999999" w:sz="4"/>
+            </w:tcBorders>
+          </w:tcPr>
+          <w:p>
+            <w:pPr>
+              <w:jc w:val="center"/>
+            </w:pPr>
+            <w:r>
+              <w:rPr>
+                <w:b w:val="false"/>
+                <w:bCs w:val="false"/>
+                <w:sz w:val="17"/>
+                <w:szCs w:val="17"/>
+              </w:rPr>
+              <w:t xml:space="preserve">0.545</w:t>
+            </w:r>
+          </w:p>
+        </w:tc>
+        <w:tc>
+          <w:tcPr>
+            <w:tcW w:type="dxa" w:w="1504"/>
+            <w:tcBorders>
+              <w:top w:val="single" w:color="999999" w:sz="4"/>
+              <w:left w:val="single" w:color="999999" w:sz="4"/>
+              <w:bottom w:val="single" w:color="999999" w:sz="4"/>
+              <w:right w:val="single" w:color="999999" w:sz="4"/>
+            </w:tcBorders>
+          </w:tcPr>
+          <w:p>
+            <w:pPr>
+              <w:jc w:val="center"/>
+            </w:pPr>
+            <w:r>
+              <w:rPr>
+                <w:b w:val="false"/>
+                <w:bCs w:val="false"/>
+                <w:sz w:val="17"/>
+                <w:szCs w:val="17"/>
+              </w:rPr>
+              <w:t xml:space="preserve">0.95</w:t>
+            </w:r>
+          </w:p>
+        </w:tc>
+        <w:tc>
+          <w:tcPr>
+            <w:tcW w:type="dxa" w:w="1504"/>
+            <w:tcBorders>
+              <w:top w:val="single" w:color="999999" w:sz="4"/>
+              <w:left w:val="single" w:color="999999" w:sz="4"/>
+              <w:bottom w:val="single" w:color="999999" w:sz="4"/>
+              <w:right w:val="single" w:color="999999" w:sz="4"/>
+            </w:tcBorders>
+          </w:tcPr>
+          <w:p>
+            <w:pPr>
+              <w:jc w:val="center"/>
+            </w:pPr>
+            <w:r>
+              <w:rPr>
+                <w:b w:val="false"/>
+                <w:bCs w:val="false"/>
+                <w:sz w:val="17"/>
+                <w:szCs w:val="17"/>
+              </w:rPr>
+              <w:t xml:space="preserve">+0.335 [+0.225, +0.435]</w:t>
+            </w:r>
+          </w:p>
+        </w:tc>
+        <w:tc>
+          <w:tcPr>
+            <w:tcW w:type="dxa" w:w="1504"/>
+            <w:tcBorders>
+              <w:top w:val="single" w:color="999999" w:sz="4"/>
+              <w:left w:val="single" w:color="999999" w:sz="4"/>
+              <w:bottom w:val="single" w:color="999999" w:sz="4"/>
+              <w:right w:val="single" w:color="999999" w:sz="4"/>
+            </w:tcBorders>
+          </w:tcPr>
+          <w:p>
+            <w:pPr>
+              <w:jc w:val="center"/>
+            </w:pPr>
+            <w:r>
+              <w:rPr>
+                <w:b w:val="false"/>
+                <w:bCs w:val="false"/>
+                <w:sz w:val="17"/>
+                <w:szCs w:val="17"/>
+              </w:rPr>
+              <w:t xml:space="preserve">&lt; 0.001</w:t>
+            </w:r>
+          </w:p>
+        </w:tc>
+      </w:tr>
+      <w:tr>
+        <w:trPr>
+          <w:tblHeader w:val="off"/>
+        </w:trPr>
+        <w:tc>
+          <w:tcPr>
+            <w:tcW w:type="dxa" w:w="1504"/>
+            <w:tcBorders>
+              <w:top w:val="single" w:color="999999" w:sz="4"/>
+              <w:left w:val="single" w:color="999999" w:sz="4"/>
+              <w:bottom w:val="single" w:color="999999" w:sz="4"/>
+              <w:right w:val="single" w:color="999999" w:sz="4"/>
+            </w:tcBorders>
+          </w:tcPr>
+          <w:p>
+            <w:pPr>
+              <w:jc w:val="center"/>
+            </w:pPr>
+          </w:p>
+        </w:tc>
+        <w:tc>
+          <w:tcPr>
+            <w:tcW w:type="dxa" w:w="1504"/>
+            <w:tcBorders>
+              <w:top w:val="single" w:color="999999" w:sz="4"/>
+              <w:left w:val="single" w:color="999999" w:sz="4"/>
+              <w:bottom w:val="single" w:color="999999" w:sz="4"/>
+              <w:right w:val="single" w:color="999999" w:sz="4"/>
+            </w:tcBorders>
+          </w:tcPr>
+          <w:p>
+            <w:pPr>
+              <w:jc w:val="center"/>
+            </w:pPr>
+            <w:r>
+              <w:rPr>
+                <w:b w:val="false"/>
+                <w:bCs w:val="false"/>
+                <w:sz w:val="17"/>
+                <w:szCs w:val="17"/>
+              </w:rPr>
+              <w:t xml:space="preserve">filt5</w:t>
+            </w:r>
+          </w:p>
+        </w:tc>
+        <w:tc>
+          <w:tcPr>
+            <w:tcW w:type="dxa" w:w="1504"/>
+            <w:tcBorders>
+              <w:top w:val="single" w:color="999999" w:sz="4"/>
+              <w:left w:val="single" w:color="999999" w:sz="4"/>
+              <w:bottom w:val="single" w:color="999999" w:sz="4"/>
+              <w:right w:val="single" w:color="999999" w:sz="4"/>
+            </w:tcBorders>
+          </w:tcPr>
+          <w:p>
+            <w:pPr>
+              <w:jc w:val="center"/>
+            </w:pPr>
+            <w:r>
+              <w:rPr>
+                <w:b w:val="false"/>
+                <w:bCs w:val="false"/>
+                <w:sz w:val="17"/>
+                <w:szCs w:val="17"/>
+              </w:rPr>
+              <w:t xml:space="preserve">0.515</w:t>
+            </w:r>
+          </w:p>
+        </w:tc>
+        <w:tc>
+          <w:tcPr>
+            <w:tcW w:type="dxa" w:w="1504"/>
+            <w:tcBorders>
+              <w:top w:val="single" w:color="999999" w:sz="4"/>
+              <w:left w:val="single" w:color="999999" w:sz="4"/>
+              <w:bottom w:val="single" w:color="999999" w:sz="4"/>
+              <w:right w:val="single" w:color="999999" w:sz="4"/>
+            </w:tcBorders>
+          </w:tcPr>
+          <w:p>
+            <w:pPr>
+              <w:jc w:val="center"/>
+            </w:pPr>
+            <w:r>
+              <w:rPr>
+                <w:b w:val="false"/>
+                <w:bCs w:val="false"/>
+                <w:sz w:val="17"/>
+                <w:szCs w:val="17"/>
+              </w:rPr>
+              <w:t xml:space="preserve">0.94</w:t>
+            </w:r>
+          </w:p>
+        </w:tc>
+        <w:tc>
+          <w:tcPr>
+            <w:tcW w:type="dxa" w:w="1504"/>
+            <w:tcBorders>
+              <w:top w:val="single" w:color="999999" w:sz="4"/>
+              <w:left w:val="single" w:color="999999" w:sz="4"/>
+              <w:bottom w:val="single" w:color="999999" w:sz="4"/>
+              <w:right w:val="single" w:color="999999" w:sz="4"/>
+            </w:tcBorders>
+          </w:tcPr>
+          <w:p>
+            <w:pPr>
+              <w:jc w:val="center"/>
+            </w:pPr>
+            <w:r>
+              <w:rPr>
+                <w:b w:val="false"/>
+                <w:bCs w:val="false"/>
+                <w:sz w:val="17"/>
+                <w:szCs w:val="17"/>
+              </w:rPr>
+              <w:t xml:space="preserve">+0.305 [+0.180, +0.410]</w:t>
+            </w:r>
+          </w:p>
+        </w:tc>
+        <w:tc>
+          <w:tcPr>
+            <w:tcW w:type="dxa" w:w="1504"/>
+            <w:tcBorders>
+              <w:top w:val="single" w:color="999999" w:sz="4"/>
+              <w:left w:val="single" w:color="999999" w:sz="4"/>
+              <w:bottom w:val="single" w:color="999999" w:sz="4"/>
+              <w:right w:val="single" w:color="999999" w:sz="4"/>
+            </w:tcBorders>
+          </w:tcPr>
+          <w:p>
+            <w:pPr>
+              <w:jc w:val="center"/>
+            </w:pPr>
+            <w:r>
+              <w:rPr>
+                <w:b w:val="false"/>
+                <w:bCs w:val="false"/>
+                <w:sz w:val="17"/>
+                <w:szCs w:val="17"/>
+              </w:rPr>
+              <w:t xml:space="preserve">&lt; 0.001</w:t>
+            </w:r>
+          </w:p>
+        </w:tc>
+      </w:tr>
+      <w:tr>
+        <w:trPr>
+          <w:tblHeader w:val="off"/>
+        </w:trPr>
+        <w:tc>
+          <w:tcPr>
+            <w:tcW w:type="dxa" w:w="1504"/>
+            <w:tcBorders>
+              <w:top w:val="single" w:color="999999" w:sz="4"/>
+              <w:left w:val="single" w:color="999999" w:sz="4"/>
+              <w:bottom w:val="single" w:color="999999" w:sz="4"/>
+              <w:right w:val="single" w:color="999999" w:sz="4"/>
+            </w:tcBorders>
+          </w:tcPr>
+          <w:p>
+            <w:pPr>
+              <w:jc w:val="center"/>
+            </w:pPr>
+            <w:r>
+              <w:rPr>
+                <w:b w:val="false"/>
+                <w:bCs w:val="false"/>
+                <w:sz w:val="17"/>
+                <w:szCs w:val="17"/>
+              </w:rPr>
+              <w:t xml:space="preserve">33 ms</w:t>
+            </w:r>
+          </w:p>
+        </w:tc>
+        <w:tc>
+          <w:tcPr>
+            <w:tcW w:type="dxa" w:w="1504"/>
+            <w:tcBorders>
+              <w:top w:val="single" w:color="999999" w:sz="4"/>
+              <w:left w:val="single" w:color="999999" w:sz="4"/>
+              <w:bottom w:val="single" w:color="999999" w:sz="4"/>
+              <w:right w:val="single" w:color="999999" w:sz="4"/>
+            </w:tcBorders>
+          </w:tcPr>
+          <w:p>
+            <w:pPr>
+              <w:jc w:val="center"/>
+            </w:pPr>
+            <w:r>
+              <w:rPr>
+                <w:b w:val="false"/>
+                <w:bCs w:val="false"/>
+                <w:sz w:val="17"/>
+                <w:szCs w:val="17"/>
+              </w:rPr>
+              <w:t xml:space="preserve">기준</w:t>
+            </w:r>
+          </w:p>
+        </w:tc>
+        <w:tc>
+          <w:tcPr>
+            <w:tcW w:type="dxa" w:w="1504"/>
+            <w:tcBorders>
+              <w:top w:val="single" w:color="999999" w:sz="4"/>
+              <w:left w:val="single" w:color="999999" w:sz="4"/>
+              <w:bottom w:val="single" w:color="999999" w:sz="4"/>
+              <w:right w:val="single" w:color="999999" w:sz="4"/>
+            </w:tcBorders>
+          </w:tcPr>
+          <w:p>
+            <w:pPr>
+              <w:jc w:val="center"/>
+            </w:pPr>
+            <w:r>
+              <w:rPr>
+                <w:b w:val="false"/>
+                <w:bCs w:val="false"/>
+                <w:sz w:val="17"/>
+                <w:szCs w:val="17"/>
+              </w:rPr>
+              <w:t xml:space="preserve">0.320</w:t>
+            </w:r>
+          </w:p>
+        </w:tc>
+        <w:tc>
+          <w:tcPr>
+            <w:tcW w:type="dxa" w:w="1504"/>
+            <w:tcBorders>
+              <w:top w:val="single" w:color="999999" w:sz="4"/>
+              <w:left w:val="single" w:color="999999" w:sz="4"/>
+              <w:bottom w:val="single" w:color="999999" w:sz="4"/>
+              <w:right w:val="single" w:color="999999" w:sz="4"/>
+            </w:tcBorders>
+          </w:tcPr>
+          <w:p>
+            <w:pPr>
+              <w:jc w:val="center"/>
+            </w:pPr>
+            <w:r>
+              <w:rPr>
+                <w:b w:val="false"/>
+                <w:bCs w:val="false"/>
+                <w:sz w:val="17"/>
+                <w:szCs w:val="17"/>
+              </w:rPr>
+              <w:t xml:space="preserve">0.48</w:t>
+            </w:r>
+          </w:p>
+        </w:tc>
+        <w:tc>
+          <w:tcPr>
+            <w:tcW w:type="dxa" w:w="1504"/>
+            <w:tcBorders>
+              <w:top w:val="single" w:color="999999" w:sz="4"/>
+              <w:left w:val="single" w:color="999999" w:sz="4"/>
+              <w:bottom w:val="single" w:color="999999" w:sz="4"/>
+              <w:right w:val="single" w:color="999999" w:sz="4"/>
+            </w:tcBorders>
+          </w:tcPr>
+          <w:p>
+            <w:pPr>
+              <w:jc w:val="center"/>
+            </w:pPr>
+            <w:r>
+              <w:rPr>
+                <w:b w:val="false"/>
+                <w:bCs w:val="false"/>
+                <w:sz w:val="17"/>
+                <w:szCs w:val="17"/>
+              </w:rPr>
+              <w:t xml:space="preserve">—</w:t>
+            </w:r>
+          </w:p>
+        </w:tc>
+        <w:tc>
+          <w:tcPr>
+            <w:tcW w:type="dxa" w:w="1504"/>
+            <w:tcBorders>
+              <w:top w:val="single" w:color="999999" w:sz="4"/>
+              <w:left w:val="single" w:color="999999" w:sz="4"/>
+              <w:bottom w:val="single" w:color="999999" w:sz="4"/>
+              <w:right w:val="single" w:color="999999" w:sz="4"/>
+            </w:tcBorders>
+          </w:tcPr>
+          <w:p>
+            <w:pPr>
+              <w:jc w:val="center"/>
+            </w:pPr>
+            <w:r>
+              <w:rPr>
+                <w:b w:val="false"/>
+                <w:bCs w:val="false"/>
+                <w:sz w:val="17"/>
+                <w:szCs w:val="17"/>
+              </w:rPr>
+              <w:t xml:space="preserve">—</w:t>
+            </w:r>
+          </w:p>
+        </w:tc>
+      </w:tr>
+      <w:tr>
+        <w:trPr>
+          <w:tblHeader w:val="off"/>
+        </w:trPr>
+        <w:tc>
+          <w:tcPr>
+            <w:tcW w:type="dxa" w:w="1504"/>
+            <w:tcBorders>
+              <w:top w:val="single" w:color="999999" w:sz="4"/>
+              <w:left w:val="single" w:color="999999" w:sz="4"/>
+              <w:bottom w:val="single" w:color="999999" w:sz="4"/>
+              <w:right w:val="single" w:color="999999" w:sz="4"/>
+            </w:tcBorders>
+          </w:tcPr>
+          <w:p>
+            <w:pPr>
+              <w:jc w:val="center"/>
+            </w:pPr>
+          </w:p>
+        </w:tc>
+        <w:tc>
+          <w:tcPr>
+            <w:tcW w:type="dxa" w:w="1504"/>
+            <w:tcBorders>
+              <w:top w:val="single" w:color="999999" w:sz="4"/>
+              <w:left w:val="single" w:color="999999" w:sz="4"/>
+              <w:bottom w:val="single" w:color="999999" w:sz="4"/>
+              <w:right w:val="single" w:color="999999" w:sz="4"/>
+            </w:tcBorders>
+          </w:tcPr>
+          <w:p>
+            <w:pPr>
+              <w:jc w:val="center"/>
+            </w:pPr>
+            <w:r>
+              <w:rPr>
+                <w:b w:val="false"/>
+                <w:bCs w:val="false"/>
+                <w:sz w:val="17"/>
+                <w:szCs w:val="17"/>
+              </w:rPr>
+              <w:t xml:space="preserve">성능형</w:t>
+            </w:r>
+          </w:p>
+        </w:tc>
+        <w:tc>
+          <w:tcPr>
+            <w:tcW w:type="dxa" w:w="1504"/>
+            <w:tcBorders>
+              <w:top w:val="single" w:color="999999" w:sz="4"/>
+              <w:left w:val="single" w:color="999999" w:sz="4"/>
+              <w:bottom w:val="single" w:color="999999" w:sz="4"/>
+              <w:right w:val="single" w:color="999999" w:sz="4"/>
+            </w:tcBorders>
+          </w:tcPr>
+          <w:p>
+            <w:pPr>
+              <w:jc w:val="center"/>
+            </w:pPr>
+            <w:r>
+              <w:rPr>
+                <w:b w:val="false"/>
+                <w:bCs w:val="false"/>
+                <w:sz w:val="17"/>
+                <w:szCs w:val="17"/>
+              </w:rPr>
+              <w:t xml:space="preserve">0.460</w:t>
+            </w:r>
+          </w:p>
+        </w:tc>
+        <w:tc>
+          <w:tcPr>
+            <w:tcW w:type="dxa" w:w="1504"/>
+            <w:tcBorders>
+              <w:top w:val="single" w:color="999999" w:sz="4"/>
+              <w:left w:val="single" w:color="999999" w:sz="4"/>
+              <w:bottom w:val="single" w:color="999999" w:sz="4"/>
+              <w:right w:val="single" w:color="999999" w:sz="4"/>
+            </w:tcBorders>
+          </w:tcPr>
+          <w:p>
+            <w:pPr>
+              <w:jc w:val="center"/>
+            </w:pPr>
+            <w:r>
+              <w:rPr>
+                <w:b w:val="false"/>
+                <w:bCs w:val="false"/>
+                <w:sz w:val="17"/>
+                <w:szCs w:val="17"/>
+              </w:rPr>
+              <w:t xml:space="preserve">0.93</w:t>
+            </w:r>
+          </w:p>
+        </w:tc>
+        <w:tc>
+          <w:tcPr>
+            <w:tcW w:type="dxa" w:w="1504"/>
+            <w:tcBorders>
+              <w:top w:val="single" w:color="999999" w:sz="4"/>
+              <w:left w:val="single" w:color="999999" w:sz="4"/>
+              <w:bottom w:val="single" w:color="999999" w:sz="4"/>
+              <w:right w:val="single" w:color="999999" w:sz="4"/>
+            </w:tcBorders>
+          </w:tcPr>
+          <w:p>
+            <w:pPr>
+              <w:jc w:val="center"/>
+            </w:pPr>
+            <w:r>
+              <w:rPr>
+                <w:b w:val="false"/>
+                <w:bCs w:val="false"/>
+                <w:sz w:val="17"/>
+                <w:szCs w:val="17"/>
+              </w:rPr>
+              <w:t xml:space="preserve">+0.140 [+0.015, +0.260]</w:t>
+            </w:r>
+          </w:p>
+        </w:tc>
+        <w:tc>
+          <w:tcPr>
+            <w:tcW w:type="dxa" w:w="1504"/>
+            <w:tcBorders>
+              <w:top w:val="single" w:color="999999" w:sz="4"/>
+              <w:left w:val="single" w:color="999999" w:sz="4"/>
+              <w:bottom w:val="single" w:color="999999" w:sz="4"/>
+              <w:right w:val="single" w:color="999999" w:sz="4"/>
+            </w:tcBorders>
+          </w:tcPr>
+          <w:p>
+            <w:pPr>
+              <w:jc w:val="center"/>
+            </w:pPr>
+            <w:r>
+              <w:rPr>
+                <w:b w:val="false"/>
+                <w:bCs w:val="false"/>
+                <w:sz w:val="17"/>
+                <w:szCs w:val="17"/>
+              </w:rPr>
+              <w:t xml:space="preserve">0.19</w:t>
+            </w:r>
+          </w:p>
+        </w:tc>
+      </w:tr>
+      <w:tr>
+        <w:trPr>
+          <w:tblHeader w:val="off"/>
+        </w:trPr>
+        <w:tc>
+          <w:tcPr>
+            <w:tcW w:type="dxa" w:w="1504"/>
+            <w:tcBorders>
+              <w:top w:val="single" w:color="999999" w:sz="4"/>
+              <w:left w:val="single" w:color="999999" w:sz="4"/>
+              <w:bottom w:val="single" w:color="999999" w:sz="4"/>
+              <w:right w:val="single" w:color="999999" w:sz="4"/>
+            </w:tcBorders>
+          </w:tcPr>
+          <w:p>
+            <w:pPr>
+              <w:jc w:val="center"/>
+            </w:pPr>
+          </w:p>
+        </w:tc>
+        <w:tc>
+          <w:tcPr>
+            <w:tcW w:type="dxa" w:w="1504"/>
+            <w:tcBorders>
+              <w:top w:val="single" w:color="999999" w:sz="4"/>
+              <w:left w:val="single" w:color="999999" w:sz="4"/>
+              <w:bottom w:val="single" w:color="999999" w:sz="4"/>
+              <w:right w:val="single" w:color="999999" w:sz="4"/>
+            </w:tcBorders>
+          </w:tcPr>
+          <w:p>
+            <w:pPr>
+              <w:jc w:val="center"/>
+            </w:pPr>
+            <w:r>
+              <w:rPr>
+                <w:b w:val="false"/>
+                <w:bCs w:val="false"/>
+                <w:sz w:val="17"/>
+                <w:szCs w:val="17"/>
+              </w:rPr>
+              <w:t xml:space="preserve">절충형</w:t>
+            </w:r>
+          </w:p>
+        </w:tc>
+        <w:tc>
+          <w:tcPr>
+            <w:tcW w:type="dxa" w:w="1504"/>
+            <w:tcBorders>
+              <w:top w:val="single" w:color="999999" w:sz="4"/>
+              <w:left w:val="single" w:color="999999" w:sz="4"/>
+              <w:bottom w:val="single" w:color="999999" w:sz="4"/>
+              <w:right w:val="single" w:color="999999" w:sz="4"/>
+            </w:tcBorders>
+          </w:tcPr>
+          <w:p>
+            <w:pPr>
+              <w:jc w:val="center"/>
+            </w:pPr>
+            <w:r>
+              <w:rPr>
+                <w:b w:val="false"/>
+                <w:bCs w:val="false"/>
+                <w:sz w:val="17"/>
+                <w:szCs w:val="17"/>
+              </w:rPr>
+              <w:t xml:space="preserve">0.520</w:t>
+            </w:r>
+          </w:p>
+        </w:tc>
+        <w:tc>
+          <w:tcPr>
+            <w:tcW w:type="dxa" w:w="1504"/>
+            <w:tcBorders>
+              <w:top w:val="single" w:color="999999" w:sz="4"/>
+              <w:left w:val="single" w:color="999999" w:sz="4"/>
+              <w:bottom w:val="single" w:color="999999" w:sz="4"/>
+              <w:right w:val="single" w:color="999999" w:sz="4"/>
+            </w:tcBorders>
+          </w:tcPr>
+          <w:p>
+            <w:pPr>
+              <w:jc w:val="center"/>
+            </w:pPr>
+            <w:r>
+              <w:rPr>
+                <w:b w:val="false"/>
+                <w:bCs w:val="false"/>
+                <w:sz w:val="17"/>
+                <w:szCs w:val="17"/>
+              </w:rPr>
+              <w:t xml:space="preserve">0.95</w:t>
+            </w:r>
+          </w:p>
+        </w:tc>
+        <w:tc>
+          <w:tcPr>
+            <w:tcW w:type="dxa" w:w="1504"/>
+            <w:tcBorders>
+              <w:top w:val="single" w:color="999999" w:sz="4"/>
+              <w:left w:val="single" w:color="999999" w:sz="4"/>
+              <w:bottom w:val="single" w:color="999999" w:sz="4"/>
+              <w:right w:val="single" w:color="999999" w:sz="4"/>
+            </w:tcBorders>
+          </w:tcPr>
+          <w:p>
+            <w:pPr>
+              <w:jc w:val="center"/>
+            </w:pPr>
+            <w:r>
+              <w:rPr>
+                <w:b w:val="false"/>
+                <w:bCs w:val="false"/>
+                <w:sz w:val="17"/>
+                <w:szCs w:val="17"/>
+              </w:rPr>
+              <w:t xml:space="preserve">+0.200 [+0.080, +0.315]</w:t>
+            </w:r>
+          </w:p>
+        </w:tc>
+        <w:tc>
+          <w:tcPr>
+            <w:tcW w:type="dxa" w:w="1504"/>
+            <w:tcBorders>
+              <w:top w:val="single" w:color="999999" w:sz="4"/>
+              <w:left w:val="single" w:color="999999" w:sz="4"/>
+              <w:bottom w:val="single" w:color="999999" w:sz="4"/>
+              <w:right w:val="single" w:color="999999" w:sz="4"/>
+            </w:tcBorders>
+          </w:tcPr>
+          <w:p>
+            <w:pPr>
+              <w:jc w:val="center"/>
+            </w:pPr>
+            <w:r>
+              <w:rPr>
+                <w:b w:val="false"/>
+                <w:bCs w:val="false"/>
+                <w:sz w:val="17"/>
+                <w:szCs w:val="17"/>
+              </w:rPr>
+              <w:t xml:space="preserve">0.018</w:t>
+            </w:r>
+          </w:p>
+        </w:tc>
+      </w:tr>
+      <w:tr>
+        <w:trPr>
+          <w:tblHeader w:val="off"/>
+        </w:trPr>
+        <w:tc>
+          <w:tcPr>
+            <w:tcW w:type="dxa" w:w="1504"/>
+            <w:tcBorders>
+              <w:top w:val="single" w:color="999999" w:sz="4"/>
+              <w:left w:val="single" w:color="999999" w:sz="4"/>
+              <w:bottom w:val="single" w:color="999999" w:sz="4"/>
+              <w:right w:val="single" w:color="999999" w:sz="4"/>
+            </w:tcBorders>
+          </w:tcPr>
+          <w:p>
+            <w:pPr>
+              <w:jc w:val="center"/>
+            </w:pPr>
+          </w:p>
+        </w:tc>
+        <w:tc>
+          <w:tcPr>
+            <w:tcW w:type="dxa" w:w="1504"/>
+            <w:tcBorders>
+              <w:top w:val="single" w:color="999999" w:sz="4"/>
+              <w:left w:val="single" w:color="999999" w:sz="4"/>
+              <w:bottom w:val="single" w:color="999999" w:sz="4"/>
+              <w:right w:val="single" w:color="999999" w:sz="4"/>
+            </w:tcBorders>
+          </w:tcPr>
+          <w:p>
+            <w:pPr>
+              <w:jc w:val="center"/>
+            </w:pPr>
+            <w:r>
+              <w:rPr>
+                <w:b w:val="false"/>
+                <w:bCs w:val="false"/>
+                <w:sz w:val="17"/>
+                <w:szCs w:val="17"/>
+              </w:rPr>
+              <w:t xml:space="preserve">filt5</w:t>
+            </w:r>
+          </w:p>
+        </w:tc>
+        <w:tc>
+          <w:tcPr>
+            <w:tcW w:type="dxa" w:w="1504"/>
+            <w:tcBorders>
+              <w:top w:val="single" w:color="999999" w:sz="4"/>
+              <w:left w:val="single" w:color="999999" w:sz="4"/>
+              <w:bottom w:val="single" w:color="999999" w:sz="4"/>
+              <w:right w:val="single" w:color="999999" w:sz="4"/>
+            </w:tcBorders>
+          </w:tcPr>
+          <w:p>
+            <w:pPr>
+              <w:jc w:val="center"/>
+            </w:pPr>
+            <w:r>
+              <w:rPr>
+                <w:b w:val="false"/>
+                <w:bCs w:val="false"/>
+                <w:sz w:val="17"/>
+                <w:szCs w:val="17"/>
+              </w:rPr>
+              <w:t xml:space="preserve">0.480</w:t>
+            </w:r>
+          </w:p>
+        </w:tc>
+        <w:tc>
+          <w:tcPr>
+            <w:tcW w:type="dxa" w:w="1504"/>
+            <w:tcBorders>
+              <w:top w:val="single" w:color="999999" w:sz="4"/>
+              <w:left w:val="single" w:color="999999" w:sz="4"/>
+              <w:bottom w:val="single" w:color="999999" w:sz="4"/>
+              <w:right w:val="single" w:color="999999" w:sz="4"/>
+            </w:tcBorders>
+          </w:tcPr>
+          <w:p>
+            <w:pPr>
+              <w:jc w:val="center"/>
+            </w:pPr>
+            <w:r>
+              <w:rPr>
+                <w:b w:val="false"/>
+                <w:bCs w:val="false"/>
+                <w:sz w:val="17"/>
+                <w:szCs w:val="17"/>
+              </w:rPr>
+              <w:t xml:space="preserve">0.94</w:t>
+            </w:r>
+          </w:p>
+        </w:tc>
+        <w:tc>
+          <w:tcPr>
+            <w:tcW w:type="dxa" w:w="1504"/>
+            <w:tcBorders>
+              <w:top w:val="single" w:color="999999" w:sz="4"/>
+              <w:left w:val="single" w:color="999999" w:sz="4"/>
+              <w:bottom w:val="single" w:color="999999" w:sz="4"/>
+              <w:right w:val="single" w:color="999999" w:sz="4"/>
+            </w:tcBorders>
+          </w:tcPr>
+          <w:p>
+            <w:pPr>
+              <w:jc w:val="center"/>
+            </w:pPr>
+            <w:r>
+              <w:rPr>
+                <w:b w:val="false"/>
+                <w:bCs w:val="false"/>
+                <w:sz w:val="17"/>
+                <w:szCs w:val="17"/>
+              </w:rPr>
+              <w:t xml:space="preserve">+0.160 [+0.035, +0.280]</w:t>
+            </w:r>
+          </w:p>
+        </w:tc>
+        <w:tc>
+          <w:tcPr>
+            <w:tcW w:type="dxa" w:w="1504"/>
+            <w:tcBorders>
+              <w:top w:val="single" w:color="999999" w:sz="4"/>
+              <w:left w:val="single" w:color="999999" w:sz="4"/>
+              <w:bottom w:val="single" w:color="999999" w:sz="4"/>
+              <w:right w:val="single" w:color="999999" w:sz="4"/>
+            </w:tcBorders>
+          </w:tcPr>
+          <w:p>
+            <w:pPr>
+              <w:jc w:val="center"/>
+            </w:pPr>
+            <w:r>
+              <w:rPr>
+                <w:b w:val="false"/>
+                <w:bCs w:val="false"/>
+                <w:sz w:val="17"/>
+                <w:szCs w:val="17"/>
+              </w:rPr>
+              <w:t xml:space="preserve">0.12</w:t>
+            </w:r>
+          </w:p>
+        </w:tc>
+      </w:tr>
+      <w:tr>
+        <w:trPr>
+          <w:tblHeader w:val="off"/>
+        </w:trPr>
+        <w:tc>
+          <w:tcPr>
+            <w:tcW w:type="dxa" w:w="1504"/>
+            <w:tcBorders>
+              <w:top w:val="single" w:color="999999" w:sz="4"/>
+              <w:left w:val="single" w:color="999999" w:sz="4"/>
+              <w:bottom w:val="single" w:color="999999" w:sz="4"/>
+              <w:right w:val="single" w:color="999999" w:sz="4"/>
+            </w:tcBorders>
+          </w:tcPr>
+          <w:p>
+            <w:pPr>
+              <w:jc w:val="center"/>
+            </w:pPr>
+            <w:r>
+              <w:rPr>
+                <w:b w:val="false"/>
+                <w:bCs w:val="false"/>
+                <w:sz w:val="17"/>
+                <w:szCs w:val="17"/>
+              </w:rPr>
+              <w:t xml:space="preserve">92 ms</w:t>
+            </w:r>
+          </w:p>
+        </w:tc>
+        <w:tc>
+          <w:tcPr>
+            <w:tcW w:type="dxa" w:w="1504"/>
+            <w:tcBorders>
+              <w:top w:val="single" w:color="999999" w:sz="4"/>
+              <w:left w:val="single" w:color="999999" w:sz="4"/>
+              <w:bottom w:val="single" w:color="999999" w:sz="4"/>
+              <w:right w:val="single" w:color="999999" w:sz="4"/>
+            </w:tcBorders>
+          </w:tcPr>
+          <w:p>
+            <w:pPr>
+              <w:jc w:val="center"/>
+            </w:pPr>
+            <w:r>
+              <w:rPr>
+                <w:b w:val="false"/>
+                <w:bCs w:val="false"/>
+                <w:sz w:val="17"/>
+                <w:szCs w:val="17"/>
+              </w:rPr>
+              <w:t xml:space="preserve">기준</w:t>
+            </w:r>
+          </w:p>
+        </w:tc>
+        <w:tc>
+          <w:tcPr>
+            <w:tcW w:type="dxa" w:w="1504"/>
+            <w:tcBorders>
+              <w:top w:val="single" w:color="999999" w:sz="4"/>
+              <w:left w:val="single" w:color="999999" w:sz="4"/>
+              <w:bottom w:val="single" w:color="999999" w:sz="4"/>
+              <w:right w:val="single" w:color="999999" w:sz="4"/>
+            </w:tcBorders>
+          </w:tcPr>
+          <w:p>
+            <w:pPr>
+              <w:jc w:val="center"/>
+            </w:pPr>
+            <w:r>
+              <w:rPr>
+                <w:b w:val="false"/>
+                <w:bCs w:val="false"/>
+                <w:sz w:val="17"/>
+                <w:szCs w:val="17"/>
+              </w:rPr>
+              <w:t xml:space="preserve">0.385</w:t>
+            </w:r>
+          </w:p>
+        </w:tc>
+        <w:tc>
+          <w:tcPr>
+            <w:tcW w:type="dxa" w:w="1504"/>
+            <w:tcBorders>
+              <w:top w:val="single" w:color="999999" w:sz="4"/>
+              <w:left w:val="single" w:color="999999" w:sz="4"/>
+              <w:bottom w:val="single" w:color="999999" w:sz="4"/>
+              <w:right w:val="single" w:color="999999" w:sz="4"/>
+            </w:tcBorders>
+          </w:tcPr>
+          <w:p>
+            <w:pPr>
+              <w:jc w:val="center"/>
+            </w:pPr>
+            <w:r>
+              <w:rPr>
+                <w:b w:val="false"/>
+                <w:bCs w:val="false"/>
+                <w:sz w:val="17"/>
+                <w:szCs w:val="17"/>
+              </w:rPr>
+              <w:t xml:space="preserve">0.46</w:t>
+            </w:r>
+          </w:p>
+        </w:tc>
+        <w:tc>
+          <w:tcPr>
+            <w:tcW w:type="dxa" w:w="1504"/>
+            <w:tcBorders>
+              <w:top w:val="single" w:color="999999" w:sz="4"/>
+              <w:left w:val="single" w:color="999999" w:sz="4"/>
+              <w:bottom w:val="single" w:color="999999" w:sz="4"/>
+              <w:right w:val="single" w:color="999999" w:sz="4"/>
+            </w:tcBorders>
+          </w:tcPr>
+          <w:p>
+            <w:pPr>
+              <w:jc w:val="center"/>
+            </w:pPr>
+            <w:r>
+              <w:rPr>
+                <w:b w:val="false"/>
+                <w:bCs w:val="false"/>
+                <w:sz w:val="17"/>
+                <w:szCs w:val="17"/>
+              </w:rPr>
+              <w:t xml:space="preserve">—</w:t>
+            </w:r>
+          </w:p>
+        </w:tc>
+        <w:tc>
+          <w:tcPr>
+            <w:tcW w:type="dxa" w:w="1504"/>
+            <w:tcBorders>
+              <w:top w:val="single" w:color="999999" w:sz="4"/>
+              <w:left w:val="single" w:color="999999" w:sz="4"/>
+              <w:bottom w:val="single" w:color="999999" w:sz="4"/>
+              <w:right w:val="single" w:color="999999" w:sz="4"/>
+            </w:tcBorders>
+          </w:tcPr>
+          <w:p>
+            <w:pPr>
+              <w:jc w:val="center"/>
+            </w:pPr>
+            <w:r>
+              <w:rPr>
+                <w:b w:val="false"/>
+                <w:bCs w:val="false"/>
+                <w:sz w:val="17"/>
+                <w:szCs w:val="17"/>
+              </w:rPr>
+              <w:t xml:space="preserve">—</w:t>
+            </w:r>
+          </w:p>
+        </w:tc>
+      </w:tr>
+      <w:tr>
+        <w:trPr>
+          <w:tblHeader w:val="off"/>
+        </w:trPr>
+        <w:tc>
+          <w:tcPr>
+            <w:tcW w:type="dxa" w:w="1504"/>
+            <w:tcBorders>
+              <w:top w:val="single" w:color="999999" w:sz="4"/>
+              <w:left w:val="single" w:color="999999" w:sz="4"/>
+              <w:bottom w:val="single" w:color="999999" w:sz="4"/>
+              <w:right w:val="single" w:color="999999" w:sz="4"/>
+            </w:tcBorders>
+          </w:tcPr>
+          <w:p>
+            <w:pPr>
+              <w:jc w:val="center"/>
+            </w:pPr>
+          </w:p>
+        </w:tc>
+        <w:tc>
+          <w:tcPr>
+            <w:tcW w:type="dxa" w:w="1504"/>
+            <w:tcBorders>
+              <w:top w:val="single" w:color="999999" w:sz="4"/>
+              <w:left w:val="single" w:color="999999" w:sz="4"/>
+              <w:bottom w:val="single" w:color="999999" w:sz="4"/>
+              <w:right w:val="single" w:color="999999" w:sz="4"/>
+            </w:tcBorders>
+          </w:tcPr>
+          <w:p>
+            <w:pPr>
+              <w:jc w:val="center"/>
+            </w:pPr>
+            <w:r>
+              <w:rPr>
+                <w:b w:val="false"/>
+                <w:bCs w:val="false"/>
+                <w:sz w:val="17"/>
+                <w:szCs w:val="17"/>
+              </w:rPr>
+              <w:t xml:space="preserve">성능형</w:t>
+            </w:r>
+          </w:p>
+        </w:tc>
+        <w:tc>
+          <w:tcPr>
+            <w:tcW w:type="dxa" w:w="1504"/>
+            <w:tcBorders>
+              <w:top w:val="single" w:color="999999" w:sz="4"/>
+              <w:left w:val="single" w:color="999999" w:sz="4"/>
+              <w:bottom w:val="single" w:color="999999" w:sz="4"/>
+              <w:right w:val="single" w:color="999999" w:sz="4"/>
+            </w:tcBorders>
+          </w:tcPr>
+          <w:p>
+            <w:pPr>
+              <w:jc w:val="center"/>
+            </w:pPr>
+            <w:r>
+              <w:rPr>
+                <w:b w:val="false"/>
+                <w:bCs w:val="false"/>
+                <w:sz w:val="17"/>
+                <w:szCs w:val="17"/>
+              </w:rPr>
+              <w:t xml:space="preserve">0.430</w:t>
+            </w:r>
+          </w:p>
+        </w:tc>
+        <w:tc>
+          <w:tcPr>
+            <w:tcW w:type="dxa" w:w="1504"/>
+            <w:tcBorders>
+              <w:top w:val="single" w:color="999999" w:sz="4"/>
+              <w:left w:val="single" w:color="999999" w:sz="4"/>
+              <w:bottom w:val="single" w:color="999999" w:sz="4"/>
+              <w:right w:val="single" w:color="999999" w:sz="4"/>
+            </w:tcBorders>
+          </w:tcPr>
+          <w:p>
+            <w:pPr>
+              <w:jc w:val="center"/>
+            </w:pPr>
+            <w:r>
+              <w:rPr>
+                <w:b w:val="false"/>
+                <w:bCs w:val="false"/>
+                <w:sz w:val="17"/>
+                <w:szCs w:val="17"/>
+              </w:rPr>
+              <w:t xml:space="preserve">0.91</w:t>
+            </w:r>
+          </w:p>
+        </w:tc>
+        <w:tc>
+          <w:tcPr>
+            <w:tcW w:type="dxa" w:w="1504"/>
+            <w:tcBorders>
+              <w:top w:val="single" w:color="999999" w:sz="4"/>
+              <w:left w:val="single" w:color="999999" w:sz="4"/>
+              <w:bottom w:val="single" w:color="999999" w:sz="4"/>
+              <w:right w:val="single" w:color="999999" w:sz="4"/>
+            </w:tcBorders>
+          </w:tcPr>
+          <w:p>
+            <w:pPr>
+              <w:jc w:val="center"/>
+            </w:pPr>
+            <w:r>
+              <w:rPr>
+                <w:b w:val="false"/>
+                <w:bCs w:val="false"/>
+                <w:sz w:val="17"/>
+                <w:szCs w:val="17"/>
+              </w:rPr>
+              <w:t xml:space="preserve">+0.045 [−0.070, +0.150]</w:t>
+            </w:r>
+          </w:p>
+        </w:tc>
+        <w:tc>
+          <w:tcPr>
+            <w:tcW w:type="dxa" w:w="1504"/>
+            <w:tcBorders>
+              <w:top w:val="single" w:color="999999" w:sz="4"/>
+              <w:left w:val="single" w:color="999999" w:sz="4"/>
+              <w:bottom w:val="single" w:color="999999" w:sz="4"/>
+              <w:right w:val="single" w:color="999999" w:sz="4"/>
+            </w:tcBorders>
+          </w:tcPr>
+          <w:p>
+            <w:pPr>
+              <w:jc w:val="center"/>
+            </w:pPr>
+            <w:r>
+              <w:rPr>
+                <w:b w:val="false"/>
+                <w:bCs w:val="false"/>
+                <w:sz w:val="17"/>
+                <w:szCs w:val="17"/>
+              </w:rPr>
+              <w:t xml:space="preserve">1.0</w:t>
+            </w:r>
+          </w:p>
+        </w:tc>
+      </w:tr>
+      <w:tr>
+        <w:trPr>
+          <w:tblHeader w:val="off"/>
+        </w:trPr>
+        <w:tc>
+          <w:tcPr>
+            <w:tcW w:type="dxa" w:w="1504"/>
+            <w:tcBorders>
+              <w:top w:val="single" w:color="999999" w:sz="4"/>
+              <w:left w:val="single" w:color="999999" w:sz="4"/>
+              <w:bottom w:val="single" w:color="999999" w:sz="4"/>
+              <w:right w:val="single" w:color="999999" w:sz="4"/>
+            </w:tcBorders>
+          </w:tcPr>
+          <w:p>
+            <w:pPr>
+              <w:jc w:val="center"/>
+            </w:pPr>
+          </w:p>
+        </w:tc>
+        <w:tc>
+          <w:tcPr>
+            <w:tcW w:type="dxa" w:w="1504"/>
+            <w:tcBorders>
+              <w:top w:val="single" w:color="999999" w:sz="4"/>
+              <w:left w:val="single" w:color="999999" w:sz="4"/>
+              <w:bottom w:val="single" w:color="999999" w:sz="4"/>
+              <w:right w:val="single" w:color="999999" w:sz="4"/>
+            </w:tcBorders>
+          </w:tcPr>
+          <w:p>
+            <w:pPr>
+              <w:jc w:val="center"/>
+            </w:pPr>
+            <w:r>
+              <w:rPr>
+                <w:b w:val="false"/>
+                <w:bCs w:val="false"/>
+                <w:sz w:val="17"/>
+                <w:szCs w:val="17"/>
+              </w:rPr>
+              <w:t xml:space="preserve">절충형</w:t>
+            </w:r>
+          </w:p>
+        </w:tc>
+        <w:tc>
+          <w:tcPr>
+            <w:tcW w:type="dxa" w:w="1504"/>
+            <w:tcBorders>
+              <w:top w:val="single" w:color="999999" w:sz="4"/>
+              <w:left w:val="single" w:color="999999" w:sz="4"/>
+              <w:bottom w:val="single" w:color="999999" w:sz="4"/>
+              <w:right w:val="single" w:color="999999" w:sz="4"/>
+            </w:tcBorders>
+          </w:tcPr>
+          <w:p>
+            <w:pPr>
+              <w:jc w:val="center"/>
+            </w:pPr>
+            <w:r>
+              <w:rPr>
+                <w:b w:val="false"/>
+                <w:bCs w:val="false"/>
+                <w:sz w:val="17"/>
+                <w:szCs w:val="17"/>
+              </w:rPr>
+              <w:t xml:space="preserve">0.420</w:t>
+            </w:r>
+          </w:p>
+        </w:tc>
+        <w:tc>
+          <w:tcPr>
+            <w:tcW w:type="dxa" w:w="1504"/>
+            <w:tcBorders>
+              <w:top w:val="single" w:color="999999" w:sz="4"/>
+              <w:left w:val="single" w:color="999999" w:sz="4"/>
+              <w:bottom w:val="single" w:color="999999" w:sz="4"/>
+              <w:right w:val="single" w:color="999999" w:sz="4"/>
+            </w:tcBorders>
+          </w:tcPr>
+          <w:p>
+            <w:pPr>
+              <w:jc w:val="center"/>
+            </w:pPr>
+            <w:r>
+              <w:rPr>
+                <w:b w:val="false"/>
+                <w:bCs w:val="false"/>
+                <w:sz w:val="17"/>
+                <w:szCs w:val="17"/>
+              </w:rPr>
+              <w:t xml:space="preserve">0.94</w:t>
+            </w:r>
+          </w:p>
+        </w:tc>
+        <w:tc>
+          <w:tcPr>
+            <w:tcW w:type="dxa" w:w="1504"/>
+            <w:tcBorders>
+              <w:top w:val="single" w:color="999999" w:sz="4"/>
+              <w:left w:val="single" w:color="999999" w:sz="4"/>
+              <w:bottom w:val="single" w:color="999999" w:sz="4"/>
+              <w:right w:val="single" w:color="999999" w:sz="4"/>
+            </w:tcBorders>
+          </w:tcPr>
+          <w:p>
+            <w:pPr>
+              <w:jc w:val="center"/>
+            </w:pPr>
+            <w:r>
+              <w:rPr>
+                <w:b w:val="false"/>
+                <w:bCs w:val="false"/>
+                <w:sz w:val="17"/>
+                <w:szCs w:val="17"/>
+              </w:rPr>
+              <w:t xml:space="preserve">+0.035 [−0.085, +0.150]</w:t>
+            </w:r>
+          </w:p>
+        </w:tc>
+        <w:tc>
+          <w:tcPr>
+            <w:tcW w:type="dxa" w:w="1504"/>
+            <w:tcBorders>
+              <w:top w:val="single" w:color="999999" w:sz="4"/>
+              <w:left w:val="single" w:color="999999" w:sz="4"/>
+              <w:bottom w:val="single" w:color="999999" w:sz="4"/>
+              <w:right w:val="single" w:color="999999" w:sz="4"/>
+            </w:tcBorders>
+          </w:tcPr>
+          <w:p>
+            <w:pPr>
+              <w:jc w:val="center"/>
+            </w:pPr>
+            <w:r>
+              <w:rPr>
+                <w:b w:val="false"/>
+                <w:bCs w:val="false"/>
+                <w:sz w:val="17"/>
+                <w:szCs w:val="17"/>
+              </w:rPr>
+              <w:t xml:space="preserve">1.0</w:t>
+            </w:r>
+          </w:p>
+        </w:tc>
+      </w:tr>
+      <w:tr>
+        <w:trPr>
+          <w:tblHeader w:val="off"/>
+        </w:trPr>
+        <w:tc>
+          <w:tcPr>
+            <w:tcW w:type="dxa" w:w="1504"/>
+            <w:tcBorders>
+              <w:top w:val="single" w:color="999999" w:sz="4"/>
+              <w:left w:val="single" w:color="999999" w:sz="4"/>
+              <w:bottom w:val="single" w:color="999999" w:sz="4"/>
+              <w:right w:val="single" w:color="999999" w:sz="4"/>
+            </w:tcBorders>
+          </w:tcPr>
+          <w:p>
+            <w:pPr>
+              <w:jc w:val="center"/>
+            </w:pPr>
+          </w:p>
+        </w:tc>
+        <w:tc>
+          <w:tcPr>
+            <w:tcW w:type="dxa" w:w="1504"/>
+            <w:tcBorders>
+              <w:top w:val="single" w:color="999999" w:sz="4"/>
+              <w:left w:val="single" w:color="999999" w:sz="4"/>
+              <w:bottom w:val="single" w:color="999999" w:sz="4"/>
+              <w:right w:val="single" w:color="999999" w:sz="4"/>
+            </w:tcBorders>
+          </w:tcPr>
+          <w:p>
+            <w:pPr>
+              <w:jc w:val="center"/>
+            </w:pPr>
+            <w:r>
+              <w:rPr>
+                <w:b w:val="false"/>
+                <w:bCs w:val="false"/>
+                <w:sz w:val="17"/>
+                <w:szCs w:val="17"/>
+              </w:rPr>
+              <w:t xml:space="preserve">filt5</w:t>
+            </w:r>
+          </w:p>
+        </w:tc>
+        <w:tc>
+          <w:tcPr>
+            <w:tcW w:type="dxa" w:w="1504"/>
+            <w:tcBorders>
+              <w:top w:val="single" w:color="999999" w:sz="4"/>
+              <w:left w:val="single" w:color="999999" w:sz="4"/>
+              <w:bottom w:val="single" w:color="999999" w:sz="4"/>
+              <w:right w:val="single" w:color="999999" w:sz="4"/>
+            </w:tcBorders>
+          </w:tcPr>
+          <w:p>
+            <w:pPr>
+              <w:jc w:val="center"/>
+            </w:pPr>
+            <w:r>
+              <w:rPr>
+                <w:b w:val="false"/>
+                <w:bCs w:val="false"/>
+                <w:sz w:val="17"/>
+                <w:szCs w:val="17"/>
+              </w:rPr>
+              <w:t xml:space="preserve">0.455</w:t>
+            </w:r>
+          </w:p>
+        </w:tc>
+        <w:tc>
+          <w:tcPr>
+            <w:tcW w:type="dxa" w:w="1504"/>
+            <w:tcBorders>
+              <w:top w:val="single" w:color="999999" w:sz="4"/>
+              <w:left w:val="single" w:color="999999" w:sz="4"/>
+              <w:bottom w:val="single" w:color="999999" w:sz="4"/>
+              <w:right w:val="single" w:color="999999" w:sz="4"/>
+            </w:tcBorders>
+          </w:tcPr>
+          <w:p>
+            <w:pPr>
+              <w:jc w:val="center"/>
+            </w:pPr>
+            <w:r>
+              <w:rPr>
+                <w:b w:val="false"/>
+                <w:bCs w:val="false"/>
+                <w:sz w:val="17"/>
+                <w:szCs w:val="17"/>
+              </w:rPr>
+              <w:t xml:space="preserve">0.93</w:t>
+            </w:r>
+          </w:p>
+        </w:tc>
+        <w:tc>
+          <w:tcPr>
+            <w:tcW w:type="dxa" w:w="1504"/>
+            <w:tcBorders>
+              <w:top w:val="single" w:color="999999" w:sz="4"/>
+              <w:left w:val="single" w:color="999999" w:sz="4"/>
+              <w:bottom w:val="single" w:color="999999" w:sz="4"/>
+              <w:right w:val="single" w:color="999999" w:sz="4"/>
+            </w:tcBorders>
+          </w:tcPr>
+          <w:p>
+            <w:pPr>
+              <w:jc w:val="center"/>
+            </w:pPr>
+            <w:r>
+              <w:rPr>
+                <w:b w:val="false"/>
+                <w:bCs w:val="false"/>
+                <w:sz w:val="17"/>
+                <w:szCs w:val="17"/>
+              </w:rPr>
+              <w:t xml:space="preserve">+0.070 [−0.055, +0.185]</w:t>
+            </w:r>
+          </w:p>
+        </w:tc>
+        <w:tc>
+          <w:tcPr>
+            <w:tcW w:type="dxa" w:w="1504"/>
+            <w:tcBorders>
+              <w:top w:val="single" w:color="999999" w:sz="4"/>
+              <w:left w:val="single" w:color="999999" w:sz="4"/>
+              <w:bottom w:val="single" w:color="999999" w:sz="4"/>
+              <w:right w:val="single" w:color="999999" w:sz="4"/>
+            </w:tcBorders>
+          </w:tcPr>
+          <w:p>
+            <w:pPr>
+              <w:jc w:val="center"/>
+            </w:pPr>
+            <w:r>
+              <w:rPr>
+                <w:b w:val="false"/>
+                <w:bCs w:val="false"/>
+                <w:sz w:val="17"/>
+                <w:szCs w:val="17"/>
+              </w:rPr>
+              <w:t xml:space="preserve">0.71</w:t>
+            </w:r>
+          </w:p>
+        </w:tc>
+      </w:tr>
+    </w:tbl>
+    <w:p/>
+    <w:p>
+      <w:pPr>
+        <w:spacing w:after="120"/>
+        <w:jc w:val="both"/>
+      </w:pPr>
+      <w:r>
+        <w:t xml:space="preserve">자기 측만 지연될 때 기준 제어기는 17 ms에서 G 실현률이 0.54로 붕괴하고 승률이 0.21로 떨어졌다. 튜닝 설정과 filt5는 G 실현률 0.93–0.95를 유지하며 승률 0.52–0.55, 즉 지연이 없을 때의 대등 수준을 회복하였다. 교전 과정 지표도 같은 방향이었다. 세 설정 모두 수세 위치 비율을 0.22에서 0.03으로, 에너지 열세를 약 −1,580 ft에서 −7~−186 ft로 줄였고, WEZ 체류를 0.34 s에서 1.06–1.15 s로 늘렸다(모두 Holm 보정 p &lt; 0.001). 따라서 지연 강건성의 이득은 상대의 붕괴에서만 오는 것이 아니며, 튜닝은 자기 기체가 지연으로 무너지는 것을 막는다.</w:t>
+      </w:r>
+    </w:p>
+    <w:p>
+      <w:pPr>
+        <w:spacing w:after="120"/>
+        <w:jc w:val="both"/>
+      </w:pPr>
+      <w:r>
+        <w:t xml:space="preserve">지연이 커질수록 승점 효과는 줄었다(33 ms에서는 절충형만 Holm 보정 후 유의, 92 ms에서는 모두 유의하지 않음). 튜닝 설정의 G 실현률은 92 ms에서도 0.91–0.94로 유지되었으므로, 승점 효과의 감소는 튜닝 설정의 붕괴 때문이 아니다. 두 가지 요인이 겹친 것으로 보인다. 하나는 지연된 상태 정보로 지연 없는 상대와 싸우는 불리함 자체로, 튜닝 설정의 승률은 0.52–0.55에서 0.42–0.46으로 낮아졌다. 다른 하나는 기준 제어기의 승률이 지연과 함께 0.21에서 0.39로 오히려 높아진 점이다. 이때 기준 제어기의 G 실현률은 0.46–0.54로 비슷하였으므로, 이 변화는 지연에 따라 붕괴 양상이 달라졌기 때문으로 추정되며 별도 확인이 필요하다. 한편 고게인 성능형 해는 큰 지연에서 롤 각속도 추종 오차가 기준보다 커졌고(33 ms 23.9 → 51.6 °/s, 92 ms 33.5 → 61.8 °/s), 92 ms에서는 HP 차이가 기준보다 나빴다(−8.8, Wilcoxon p = 0.048). 저게인·피드포워드 절충형은 모든 지연에서 롤 추종을 개선하였다.</w:t>
+      </w:r>
+    </w:p>
+    <w:p>
+      <w:pPr>
         <w:pStyle w:val="Heading1"/>
       </w:pPr>
       <w:r>
@@ -18600,7 +20613,7 @@
         <w:t xml:space="preserve">지연 강건성은 동기화 필터 대역으로 결정된다.</w:t>
       </w:r>
       <w:r>
-        <w:t xml:space="preserve"> 기준 INDI는 8–17 ms의 짧은 측정 지연에서 붕괴하였고, 필터 분리 실험은 낮은 필터 대역이 지연 강건성의 필요충분조건임을 보였다. 이는 INDI의 궁극 경계가 동기화와 지연에 의한 특이 섭동 여유에 좌우된다는 이론[5], 그리고 높은 대역의 제어기가 지연 아래에서 불안정해진다는 관찰[2]과 일치한다. 복합 최적화는 지연 조건 없이 잡음이 있는 측정만으로 최적화했음에도 필터를 25 Hz에서 4–5 Hz로 낮추는 방향으로 수렴하였다. 잡음 아래에서 추종 품질과 부드러움을 함께 최적화한 결과 지연 여유가 함께 확보된 것이다. 설계 지침은 단순하다. 측정 잡음이 허용하는 범위에서 동기화 필터 대역을 구동기 대역 수준으로 낮추어야 한다. 6변수 최적화의 추가 가치는 큰 지연에서의 여유 확대와 명목 조건의 추종 품질 및 부드러움 개선에 있다.</w:t>
+        <w:t xml:space="preserve"> 기준 INDI는 8–17 ms의 짧은 측정 지연에서 붕괴하였고, 필터 분리 실험은 낮은 필터 대역이 지연 강건성의 필요충분조건임을 보였다. 이는 INDI의 궁극 경계가 동기화와 지연에 의한 특이 섭동 여유에 좌우된다는 이론[5], 그리고 높은 대역의 제어기가 지연 아래에서 불안정해진다는 관찰[2]과 일치한다. 복합 최적화는 지연 조건 없이 잡음이 있는 측정만으로 최적화했음에도 필터를 25 Hz에서 4–5 Hz로 낮추는 방향으로 수렴하였다. 잡음 아래에서 추종 품질과 부드러움을 함께 최적화한 결과 지연 여유가 함께 확보된 것이다. blue에만 지연을 준 실험(4.8절)에서도 튜닝 설정은 17 ms에서 승률을 0.21에서 0.52–0.55로 회복하였으므로, 이 강건성은 상대의 붕괴가 아닌 자기 기체의 안정성에서 온다. 설계 지침은 단순하다. 측정 잡음이 허용하는 범위에서 동기화 필터 대역을 구동기 대역 수준으로 낮추어야 한다. 6변수 최적화의 추가 가치는 큰 지연에서의 여유 확대와 명목 조건의 추종 품질 및 부드러움 개선에 있다.</w:t>
       </w:r>
     </w:p>
     <w:p>
@@ -18680,7 +20693,7 @@
         <w:t xml:space="preserve">연구의 한계.</w:t>
       </w:r>
       <w:r>
-        <w:t xml:space="preserve"> 첫째, 전술 트리는 세 종류에서 결과를 확인하였으나 효과의 크기는 트리에 따라 달랐다(Δ승점 +0.22–0.52). 둘째, INDI 명령이 FLCS를 거치는 구조이므로 조종면을 직접 명령하는 구조에서는 결과가 다를 수 있다. 셋째, 단일 변수 민감도의 수준별 100 대응 쌍은 ±0.08 미만의 교전 효과를 검출하기에 검정력이 부족하다. 넷째, 탐색 범위는 문헌을 근거로 정하였으며, 상한을 넓혀도 개선되지 않음을 확인하였다. 다섯째, 모든 결과는 시뮬레이션에서 얻은 것이다.</w:t>
+        <w:t xml:space="preserve"> 첫째, 전술 트리는 세 종류에서 결과를 확인하였으나 효과의 크기는 트리에 따라 달랐다(Δ승점 +0.22–0.52). 둘째, INDI 명령이 FLCS를 거치는 구조이므로 조종면을 직접 명령하는 구조에서는 결과가 다를 수 있다. 셋째, 단일 변수 민감도의 수준별 100 대응 쌍은 ±0.08 미만의 교전 효과를 검출하기에 검정력이 부족하다. 넷째, 비대칭 지연 실험에서 지연이 92 ms로 커질 때 기준 제어기의 승률이 오히려 높아진 원인은 규명하지 못하였다. 다섯째, 탐색 범위는 문헌을 근거로 정하였으며, 상한을 넓혀도 개선되지 않음을 확인하였다. 여섯째, 모든 결과는 시뮬레이션에서 얻은 것이다.</w:t>
       </w:r>
     </w:p>
     <w:p>
@@ -18706,7 +20719,7 @@
         <w:jc w:val="both"/>
       </w:pPr>
       <w:r>
-        <w:t xml:space="preserve">첫째, 복합 최적화는 추종 오차와 조종면 활동량을 동시에 줄이는 설정을 찾았으며(추종 −8~12 %, 활동량 −66~84 %), 모든 설정이 F-16 교범의 가용 G 한계를 준수하였다. 둘째, 측정 지연이 없는 조건에서 튜닝은 명령 추종 층위를 유의하게 개선하였으나 기동과 교전 결과로는 전이되지 않았다. 셋째, 기준 제어기는 8–17 ms의 각속도 측정 지연에서 요구 G의 절반만 실현하며 붕괴하였고, 튜닝 제어기는 G 실현률을 유지해 공세 위치와 에너지 우위를 확보하였다. 넷째, 지연 강건성은 동기화 필터 대역이 결정하며, 허용 지연은 차단주파수에 반비례한다(τ_max ≈ (0.15–0.3)/f_c). 다섯째, 이 결과는 세 가지 전술 트리에서 재현되었다.</w:t>
+        <w:t xml:space="preserve">첫째, 복합 최적화는 추종 오차와 조종면 활동량을 동시에 줄이는 설정을 찾았으며(추종 −8~12 %, 활동량 −66~84 %), 모든 설정이 F-16 교범의 가용 G 한계를 준수하였다. 둘째, 측정 지연이 없는 조건에서 튜닝은 명령 추종 층위를 유의하게 개선하였으나 기동과 교전 결과로는 전이되지 않았다. 셋째, 기준 제어기는 8–17 ms의 각속도 측정 지연에서 요구 G의 절반만 실현하며 붕괴하였고, 튜닝 제어기는 G 실현률을 유지해 공세 위치와 에너지 우위를 확보하였다. 자기 측만 17 ms 지연될 때에도 기준 제어기의 승률은 0.21로 떨어졌으나 튜닝 제어기는 0.52–0.55로 대등 수준을 유지하였다. 넷째, 지연 강건성은 동기화 필터 대역이 결정하며, 허용 지연은 차단주파수에 반비례한다(τ_max ≈ (0.15–0.3)/f_c). 다섯째, 이 결과는 세 가지 전술 트리에서 재현되었다.</w:t>
       </w:r>
     </w:p>
     <w:p>

</xml_diff>